<commit_message>
city-rules и Илсара: якоря q-gorod-06 / q-porcha-01
Согласовать свод города с флагманским сыском и порчей; слоты
смотрительницы явно ведут в сыск→бой у арки.

Co-authored-by: igorpogulaev485-code <igorpogulaev485-code@users.noreply.github.com>
</commit_message>
<xml_diff>
--- a/campaign/prep/locations/gorod-serebryanyy-porog/city-rules.docx
+++ b/campaign/prep/locations/gorod-serebryanyy-porog/city-rules.docx
@@ -3,64 +3,31 @@
 <w:document xmlns:wpc="http://schemas.microsoft.com/office/word/2010/wordprocessingCanvas" xmlns:mo="http://schemas.microsoft.com/office/mac/office/2008/main" xmlns:mc="http://schemas.openxmlformats.org/markup-compatibility/2006" xmlns:mv="urn:schemas-microsoft-com:mac:vml" xmlns:o="urn:schemas-microsoft-com:office:office" xmlns:r="http://schemas.openxmlformats.org/officeDocument/2006/relationships" xmlns:m="http://schemas.openxmlformats.org/officeDocument/2006/math" xmlns:v="urn:schemas-microsoft-com:vml" xmlns:wp14="http://schemas.microsoft.com/office/word/2010/wordprocessingDrawing" xmlns:wp="http://schemas.openxmlformats.org/drawingml/2006/wordprocessingDrawing" xmlns:w10="urn:schemas-microsoft-com:office:word" xmlns:w="http://schemas.openxmlformats.org/wordprocessingml/2006/main" xmlns:w14="http://schemas.microsoft.com/office/word/2010/wordml" xmlns:wpg="http://schemas.microsoft.com/office/word/2010/wordprocessingGroup" xmlns:wpi="http://schemas.microsoft.com/office/word/2010/wordprocessingInk" xmlns:wne="http://schemas.microsoft.com/office/word/2006/wordml" xmlns:wps="http://schemas.microsoft.com/office/word/2010/wordprocessingShape" mc:Ignorable="w14 wp14">
   <w:body>
     <w:p>
+      <w:pPr>
+        <w:pStyle w:val="Heading1"/>
+      </w:pPr>
       <w:r>
-        <w:t>---</w:t>
+        <w:t>Правила города — Серебряный Порог</w:t>
       </w:r>
     </w:p>
     <w:p>
       <w:r>
-        <w:t>title: "Серебряный Порог — правила города (стол)"</w:t>
+        <w:t>Один лист для мастера за столом. Детали мест — в [playbook.md](playbook.md).</w:t>
       </w:r>
     </w:p>
     <w:p>
       <w:r>
-        <w:t>status: prep</w:t>
+        <w:t>Партия сейчас с репутацией Леса −4 (soft) — активности открыты, тон и цены жёстче.</w:t>
       </w:r>
     </w:p>
     <w:p>
+      <w:pPr>
+        <w:pStyle w:val="Heading2"/>
+      </w:pPr>
       <w:r>
-        <w:t>slug: gorod-serebryanyy-porog</w:t>
+        <w:t>1 · Юрисдикция</w:t>
       </w:r>
     </w:p>
-    <w:p>
-      <w:r>
-        <w:t>lock: ../../plot/canon-lock-2026-09-28-serebryanyy-porog-city-survey.md</w:t>
-      </w:r>
-    </w:p>
-    <w:p>
-      <w:r>
-        <w:t>rules: dnd-5e-2014</w:t>
-      </w:r>
-    </w:p>
-    <w:p>
-      <w:r>
-        <w:t>---</w:t>
-      </w:r>
-    </w:p>
-    <w:p/>
-    <w:p>
-      <w:r>
-        <w:t># Правила города — Серебряный Порог</w:t>
-      </w:r>
-    </w:p>
-    <w:p/>
-    <w:p>
-      <w:r>
-        <w:t xml:space="preserve">Один лист для мастера за столом. Детали мест — в [`playbook.md`](playbook.md).  </w:t>
-      </w:r>
-    </w:p>
-    <w:p>
-      <w:r>
-        <w:t>Партия сейчас с **репутацией Леса −4 (soft)** — активности **открыты**, тон и цены жёстче.</w:t>
-      </w:r>
-    </w:p>
-    <w:p/>
-    <w:p>
-      <w:r>
-        <w:t>## 1 · Юрисдикция</w:t>
-      </w:r>
-    </w:p>
-    <w:p/>
     <w:p>
       <w:r>
         <w:t>| Зона | Кто главный | Что решает |</w:t>
@@ -73,32 +40,37 @@
     </w:p>
     <w:p>
       <w:r>
-        <w:t>| **Внутри стен** | Староста **Орлан** · стража Серебряной коры | досмотр, рынок, ночлег, споры гостей |</w:t>
+        <w:t>| Внутри стен | Староста Орлан · стража Серебряной коры | досмотр, рынок, ночлег, споры гостей |</w:t>
       </w:r>
     </w:p>
     <w:p>
       <w:r>
-        <w:t>| **Тропа к Храму + Храм** | Служители Храма (**Илсара** и др.) | портал, протокол чаш, **порча** у портала |</w:t>
+        <w:t>| Тропа к Храму + Храм | Служители Храма (Илсара и др.) | портал, протокол чаш, порча у портала |</w:t>
       </w:r>
     </w:p>
     <w:p>
       <w:r>
-        <w:t>| **Спор на границе** | Оба; часто препираются | чья смена, чей арест |</w:t>
+        <w:t>| Спор на границе | Оба; часто препираются | чья смена, чей арест |</w:t>
       </w:r>
     </w:p>
-    <w:p/>
     <w:p>
       <w:r>
-        <w:t>Город **не** ведёт расследование порчи сам — только наём / слухи / направление к Храму.</w:t>
+        <w:t>Город не ведёт бой с порчей сам — только наём / слухи / направление к Храму (q-porcha-01).</w:t>
       </w:r>
     </w:p>
-    <w:p/>
     <w:p>
       <w:r>
-        <w:t>## 2 · Статус гостя</w:t>
+        <w:t>Флагманское городское расследование сети меток — q-gorod-06 (Архив → цех → двор).</w:t>
       </w:r>
     </w:p>
-    <w:p/>
+    <w:p>
+      <w:pPr>
+        <w:pStyle w:val="Heading2"/>
+      </w:pPr>
+      <w:r>
+        <w:t>2 · Статус гостя</w:t>
+      </w:r>
+    </w:p>
     <w:p>
       <w:r>
         <w:t>| Уровень | Как получить | Что даёт |</w:t>
@@ -111,37 +83,37 @@
     </w:p>
     <w:p>
       <w:r>
-        <w:t>| **Нет метки** | вошли с юга без бумаги | пускают; лавки коротки; «незваные» в тоне |</w:t>
+        <w:t>| Нет метки | вошли с юга без бумаги | пускают; лавки коротки; «незваные» в тоне |</w:t>
       </w:r>
     </w:p>
     <w:p>
       <w:r>
-        <w:t>| **Метка гостя** (#12) | цех печатей, плата, час | нормальный торг; без полного свитка |</w:t>
+        <w:t>| Метка гостя (#12) | цех печатей, плата, час | нормальный торг; без полного свитка |</w:t>
       </w:r>
     </w:p>
     <w:p>
       <w:r>
-        <w:t>| **Гостевой свиток** (#15) | писец двора; дольше | вес в Силвании; аудиенции мягче |</w:t>
+        <w:t>| Гостевой свиток (#15) | писец двора; дольше | вес в Силвании; аудиенции мягче |</w:t>
       </w:r>
     </w:p>
     <w:p>
       <w:r>
-        <w:t>| **Красная нить** | отметка при −4 / суде | видно всем; не запрет, а ярлык |</w:t>
+        <w:t>| Красная нить | отметка при −4 / суде | видно всем; не запрет, а ярлык |</w:t>
       </w:r>
     </w:p>
-    <w:p/>
     <w:p>
       <w:r>
-        <w:t>**Солгать** в свитке / клятве (#17) — позже вспоминают (Мирэла Храма / Севин / Руваэн).</w:t>
+        <w:t>Солгать в свитке / клятве (#17) — позже вспоминают (Мирэла Храма / Севин / Руваэн).</w:t>
       </w:r>
     </w:p>
-    <w:p/>
     <w:p>
+      <w:pPr>
+        <w:pStyle w:val="Heading2"/>
+      </w:pPr>
       <w:r>
-        <w:t>## 3 · Репутация −4 (soft)</w:t>
+        <w:t>3 · Репутация −4 (soft)</w:t>
       </w:r>
     </w:p>
-    <w:p/>
     <w:p>
       <w:r>
         <w:t>| Можно | Нельзя / не выгодно |</w:t>
@@ -167,13 +139,11 @@
         <w:t>| Просить аудиенцию у Орлана | Получить длинную аудиенцию без услуги городу |</w:t>
       </w:r>
     </w:p>
-    <w:p/>
     <w:p>
       <w:r>
-        <w:t>**Наценки для партии (ориентир):**</w:t>
+        <w:t>Наценки для партии (ориентир):</w:t>
       </w:r>
     </w:p>
-    <w:p/>
     <w:p>
       <w:r>
         <w:t>| Услуга | Обычная цена | С −4 |</w:t>
@@ -201,7 +171,7 @@
     </w:p>
     <w:p>
       <w:r>
-        <w:t>| Обмен серебра → лист-марки | курс 1:1 тематически | **+10–20%** комиссии Сиэлы |</w:t>
+        <w:t>| Обмен серебра → лист-марки | курс 1:1 тематически | +10–20% комиссии Сиэлы |</w:t>
       </w:r>
     </w:p>
     <w:p>
@@ -219,25 +189,24 @@
         <w:t>| Гостевой свиток | 5 зм + время | 8 зм + красная нить |</w:t>
       </w:r>
     </w:p>
-    <w:p/>
     <w:p>
       <w:r>
         <w:t>Скидка: услуга городу, клятва (#17), Performance в #21, закрытый side.</w:t>
       </w:r>
     </w:p>
-    <w:p/>
     <w:p>
       <w:r>
-        <w:t>**Локальная репутация** (отдельный трек от −4 Леса): услуги Порогу могут дать **мягкий плюс у конкретных НПС** (Фаэлин, Каэла, Орлан) — не снимает −4 государства, но открывает тон.</w:t>
+        <w:t>Локальная репутация (отдельный трек от −4 Леса): услуги Порогу могут дать мягкий плюс у конкретных НПС (Фаэлин, Каэла, Орлан) — не снимает −4 государства, но открывает тон.</w:t>
       </w:r>
     </w:p>
-    <w:p/>
     <w:p>
+      <w:pPr>
+        <w:pStyle w:val="Heading2"/>
+      </w:pPr>
       <w:r>
-        <w:t>## 4 · Оружие и магия</w:t>
+        <w:t>4 · Оружие и магия</w:t>
       </w:r>
     </w:p>
-    <w:p/>
     <w:p>
       <w:r>
         <w:t>| Правило | Деталь |</w:t>
@@ -250,31 +219,32 @@
     </w:p>
     <w:p>
       <w:r>
-        <w:t>| **Сдача оружия** | У #2 по печати; лук «инструмент» — спор (Persuasion DC 12) |</w:t>
+        <w:t>| Сдача оружия | У #2 по печати; лук «инструмент» — спор (Persuasion DC 12) |</w:t>
       </w:r>
     </w:p>
     <w:p>
       <w:r>
-        <w:t>| **Скрытое оружие** | Если найдут — штраф 10 лист-марок **или** сутки под надзором Ниары |</w:t>
+        <w:t>| Скрытое оружие | Если найдут — штраф 10 лист-марок или сутки под надзором Ниары |</w:t>
       </w:r>
     </w:p>
     <w:p>
       <w:r>
-        <w:t>| **Боевая магия в городе** | Запрещена без нужды; щиты/ритуалы — серая зона |</w:t>
+        <w:t>| Боевая магия в городе | Запрещена без нужды; щиты/ритуалы — серая зона |</w:t>
       </w:r>
     </w:p>
     <w:p>
       <w:r>
-        <w:t>| **Открытый бой** | Стража (#3) за 1d4 раунда; эскалация → Орлан |</w:t>
+        <w:t>| Открытый бой | Стража (#3) за 1d4 раунда; эскалация → Орлан |</w:t>
       </w:r>
     </w:p>
-    <w:p/>
     <w:p>
+      <w:pPr>
+        <w:pStyle w:val="Heading2"/>
+      </w:pPr>
       <w:r>
-        <w:t>## 5 · Валюта и торг</w:t>
+        <w:t>5 · Валюта и торг</w:t>
       </w:r>
     </w:p>
-    <w:p/>
     <w:p>
       <w:r>
         <w:t>| Средство | Где |</w:t>
@@ -287,32 +257,32 @@
     </w:p>
     <w:p>
       <w:r>
-        <w:t>| **Лист-марки** Леса | основной расчёт на рынке |</w:t>
+        <w:t>| Лист-марки Леса | основной расчёт на рынке |</w:t>
       </w:r>
     </w:p>
     <w:p>
       <w:r>
-        <w:t>| **Серебро Аэлендора** | меняют у Сиэлы (#8) |</w:t>
+        <w:t>| Серебро Аэлендора | меняют у Сиэлы (#8) |</w:t>
       </w:r>
     </w:p>
     <w:p>
       <w:r>
-        <w:t>| **Жетоны проводников** | редкие; тропы / услуги Бренна |</w:t>
+        <w:t>| Жетоны проводников | редкие; тропы / услуги Бренна |</w:t>
       </w:r>
     </w:p>
-    <w:p/>
     <w:p>
       <w:r>
         <w:t>Аукцион (#11) — иногда принимает трофеи вместо марок (Insight на честность Орнвела).</w:t>
       </w:r>
     </w:p>
-    <w:p/>
     <w:p>
+      <w:pPr>
+        <w:pStyle w:val="Heading2"/>
+      </w:pPr>
       <w:r>
-        <w:t>## 6 · Патрули и время</w:t>
+        <w:t>6 · Патрули и время</w:t>
       </w:r>
     </w:p>
-    <w:p/>
     <w:p>
       <w:r>
         <w:t>| Когда | Что |</w:t>
@@ -338,19 +308,19 @@
         <w:t>| Тревога с запада | запах/дым у портала → слух о порче; пост #5 усиливают |</w:t>
       </w:r>
     </w:p>
-    <w:p/>
     <w:p>
       <w:r>
-        <w:t>Комендантского часа **нет** — есть вежливые «проводы до двери» для дебоширов.</w:t>
+        <w:t>Комендантского часа нет — есть вежливые «проводы до двери» для дебоширов.</w:t>
       </w:r>
     </w:p>
-    <w:p/>
     <w:p>
+      <w:pPr>
+        <w:pStyle w:val="Heading2"/>
+      </w:pPr>
       <w:r>
-        <w:t>## 7 · Что можно делать в городе (возможности)</w:t>
+        <w:t>7 · Что можно делать в городе (возможности)</w:t>
       </w:r>
     </w:p>
-    <w:p/>
     <w:p>
       <w:r>
         <w:t>| Хотят игроки | Куда |</w:t>
@@ -406,13 +376,14 @@
         <w:t>| Официальный вес | #14 · #15 |</w:t>
       </w:r>
     </w:p>
-    <w:p/>
     <w:p>
+      <w:pPr>
+        <w:pStyle w:val="Heading2"/>
+      </w:pPr>
       <w:r>
-        <w:t>## 8 · Запреты и серые зоны (коротко)</w:t>
+        <w:t>8 · Запреты и серые зоны (коротко)</w:t>
       </w:r>
     </w:p>
-    <w:p/>
     <w:p>
       <w:r>
         <w:t>| Запрет | Цена нарушения |</w:t>
@@ -448,13 +419,14 @@
         <w:t>| Вход в Архив без печати | выгон; при краже — охота стражи |</w:t>
       </w:r>
     </w:p>
-    <w:p/>
     <w:p>
+      <w:pPr>
+        <w:pStyle w:val="Heading2"/>
+      </w:pPr>
       <w:r>
-        <w:t>## 9 · Услуги (быстрый прайс)</w:t>
+        <w:t>9 · Услуги (быстрый прайс)</w:t>
       </w:r>
     </w:p>
-    <w:p/>
     <w:p>
       <w:r>
         <w:t>| Услуга | Где | Цена (без −4) |</w:t>
@@ -500,13 +472,14 @@
         <w:t>| Серебряные стрелы (запас Халдрина) | #13 | не продаёт — только за отчёт с порчи |</w:t>
       </w:r>
     </w:p>
-    <w:p/>
     <w:p>
+      <w:pPr>
+        <w:pStyle w:val="Heading2"/>
+      </w:pPr>
       <w:r>
-        <w:t>## 10 · Связь с аркой</w:t>
+        <w:t>10 · Связь с аркой</w:t>
       </w:r>
     </w:p>
-    <w:p/>
     <w:p>
       <w:r>
         <w:t>| Тема | В городе | Где копать дальше |</w:t>
@@ -529,7 +502,7 @@
     </w:p>
     <w:p>
       <w:r>
-        <w:t>| Порча / некромантия | слухи, наём, олени | **Храм** (не этот playbook) |</w:t>
+        <w:t>| Порча / некромантия | слухи, наём, олени | Храм (не этот playbook) |</w:t>
       </w:r>
     </w:p>
     <w:p>
@@ -537,31 +510,32 @@
         <w:t>| Монастырь | только слух / архив | Пепельный Рубеж (мастер) |</w:t>
       </w:r>
     </w:p>
-    <w:p/>
     <w:p>
+      <w:pPr>
+        <w:pStyle w:val="Heading2"/>
+      </w:pPr>
       <w:r>
-        <w:t>## 11 · Если партия медлит в городе</w:t>
-      </w:r>
-    </w:p>
-    <w:p/>
-    <w:p>
-      <w:r>
-        <w:t xml:space="preserve">1. Порча ближе к Воротам (слухи громче; пост #5 нервный).  </w:t>
+        <w:t>11 · Если партия медлит в городе</w:t>
       </w:r>
     </w:p>
     <w:p>
       <w:r>
-        <w:t xml:space="preserve">2. Наценки −4 растут ещё на ступень.  </w:t>
+        <w:t>1. Порча ближе к Воротам (слухи громче; пост #5 нервный).</w:t>
       </w:r>
     </w:p>
     <w:p>
       <w:r>
-        <w:t xml:space="preserve">3. Гонцы требуют ответа по реликвии.  </w:t>
+        <w:t>2. Наценки −4 растут ещё на ступень.</w:t>
       </w:r>
     </w:p>
     <w:p>
       <w:r>
-        <w:t xml:space="preserve">4. Проводники уходят к совету друидов — #24 пустеет.  </w:t>
+        <w:t>3. Гонцы требуют ответа по реликвии.</w:t>
+      </w:r>
+    </w:p>
+    <w:p>
+      <w:r>
+        <w:t>4. Проводники уходят к совету друидов — #24 пустеет.</w:t>
       </w:r>
     </w:p>
     <w:sectPr>

</xml_diff>